<commit_message>
Latency labelled own measurement on the CVs; drop hedge on Impact card
</commit_message>
<xml_diff>
--- a/public/downloads/Boutros_Tawaifi_CV_RealTime.docx
+++ b/public/downloads/Boutros_Tawaifi_CV_RealTime.docx
@@ -103,7 +103,7 @@
         <w:spacing w:after="40"/>
       </w:pPr>
       <w:r>
-        <w:t>Senior Full-Stack Engineer specialising in real-time data: sole developer of a live sports-data platform that has covered 50K+ matches across 70+ countries, delivering event feeds over WebSocket, RabbitMQ and REST at 70–150 ms.</w:t>
+        <w:t>Senior Full-Stack Engineer specialising in real-time data: sole developer of a live sports-data platform that has covered 50K+ matches across 70+ countries, delivering event feeds over WebSocket, RabbitMQ and REST at 70–150 ms (own measurement).</w:t>
       </w:r>
     </w:p>
     <w:p>
@@ -246,7 +246,7 @@
         <w:ind w:left="187" w:hanging="187"/>
       </w:pPr>
       <w:r>
-        <w:t>• Built the live event pipeline: de-duplication, reversal handling (e.g. cancelled goals) and strict event order, delivered to customers over WebSocket, RabbitMQ and REST at 70–150 ms request/response.</w:t>
+        <w:t>• Built the live event pipeline: de-duplication, reversal handling (e.g. cancelled goals) and strict event order, delivered to customers over WebSocket, RabbitMQ and REST at 70–150 ms request/response (own measurement).</w:t>
       </w:r>
     </w:p>
     <w:p>

</xml_diff>